<commit_message>
fix: widen Contact Dates column in Prince George court report template
Resolves #6730

The contacts table in the Prince George report template had three
equal-width columns (~2.2" each), making the Contact Dates column
too narrow. Adjusted to: Name 1.33" | Title 1.34" | Dates 4.00".
Total table width (9606 twips) preserved.

Added spec to verify column widths and prevent regressions.
</commit_message>
<xml_diff>
--- a/app/documents/templates/prince_george_report_template.docx
+++ b/app/documents/templates/prince_george_report_template.docx
@@ -381,14 +381,14 @@
         <w:tblLook w:val="04A0" w:firstRow="1" w:lastRow="0" w:firstColumn="1" w:lastColumn="0" w:noHBand="0" w:noVBand="1"/>
       </w:tblPr>
       <w:tblGrid>
-        <w:gridCol w:w="3277"/>
-        <w:gridCol w:w="3107"/>
-        <w:gridCol w:w="3222"/>
+        <w:gridCol w:w="1920"/>
+        <w:gridCol w:w="1926"/>
+        <w:gridCol w:w="5760"/>
       </w:tblGrid>
       <w:tr>
         <w:tc>
           <w:tcPr>
-            <w:tcW w:w="3277" w:type="dxa"/>
+            <w:tcW w:w="1920" w:type="dxa"/>
           </w:tcPr>
           <w:p>
             <w:pPr>
@@ -410,7 +410,7 @@
         </w:tc>
         <w:tc>
           <w:tcPr>
-            <w:tcW w:w="3107" w:type="dxa"/>
+            <w:tcW w:w="1926" w:type="dxa"/>
           </w:tcPr>
           <w:p>
             <w:pPr>
@@ -432,7 +432,7 @@
         </w:tc>
         <w:tc>
           <w:tcPr>
-            <w:tcW w:w="3222" w:type="dxa"/>
+            <w:tcW w:w="5760" w:type="dxa"/>
           </w:tcPr>
           <w:p>
             <w:pPr>
@@ -456,7 +456,7 @@
       <w:tr>
         <w:tc>
           <w:tcPr>
-            <w:tcW w:w="3277" w:type="dxa"/>
+            <w:tcW w:w="1920" w:type="dxa"/>
           </w:tcPr>
           <w:p>
             <w:pPr>
@@ -479,7 +479,7 @@
         </w:tc>
         <w:tc>
           <w:tcPr>
-            <w:tcW w:w="3107" w:type="dxa"/>
+            <w:tcW w:w="1926" w:type="dxa"/>
           </w:tcPr>
           <w:p>
             <w:pPr>
@@ -492,7 +492,7 @@
         </w:tc>
         <w:tc>
           <w:tcPr>
-            <w:tcW w:w="3222" w:type="dxa"/>
+            <w:tcW w:w="5760" w:type="dxa"/>
           </w:tcPr>
           <w:p>
             <w:pPr>
@@ -507,7 +507,7 @@
       <w:tr>
         <w:tc>
           <w:tcPr>
-            <w:tcW w:w="3277" w:type="dxa"/>
+            <w:tcW w:w="1920" w:type="dxa"/>
           </w:tcPr>
           <w:p>
             <w:pPr>
@@ -530,7 +530,7 @@
         </w:tc>
         <w:tc>
           <w:tcPr>
-            <w:tcW w:w="3107" w:type="dxa"/>
+            <w:tcW w:w="1926" w:type="dxa"/>
           </w:tcPr>
           <w:p>
             <w:pPr>
@@ -553,7 +553,7 @@
         </w:tc>
         <w:tc>
           <w:tcPr>
-            <w:tcW w:w="3222" w:type="dxa"/>
+            <w:tcW w:w="5760" w:type="dxa"/>
           </w:tcPr>
           <w:p>
             <w:pPr>
@@ -578,7 +578,7 @@
       <w:tr>
         <w:tc>
           <w:tcPr>
-            <w:tcW w:w="3277" w:type="dxa"/>
+            <w:tcW w:w="1920" w:type="dxa"/>
           </w:tcPr>
           <w:p>
             <w:pPr>
@@ -601,7 +601,7 @@
         </w:tc>
         <w:tc>
           <w:tcPr>
-            <w:tcW w:w="3107" w:type="dxa"/>
+            <w:tcW w:w="1926" w:type="dxa"/>
           </w:tcPr>
           <w:p>
             <w:pPr>
@@ -614,7 +614,7 @@
         </w:tc>
         <w:tc>
           <w:tcPr>
-            <w:tcW w:w="3222" w:type="dxa"/>
+            <w:tcW w:w="5760" w:type="dxa"/>
           </w:tcPr>
           <w:p>
             <w:pPr>

</xml_diff>